<commit_message>
V1.1 Shipped: UHI Pipeline, Shape-Aware Math, and Smart UI, Bug fixes
</commit_message>
<xml_diff>
--- a/template.docx
+++ b/template.docx
@@ -265,7 +265,6 @@
         </w:rPr>
         <w:t xml:space="preserve"> </w:t>
       </w:r>
-      <w:proofErr w:type="gramStart"/>
       <w:r>
         <w:rPr>
           <w:rStyle w:val="HTMLCode"/>
@@ -279,15 +278,7 @@
           <w:rStyle w:val="HTMLCode"/>
           <w:rFonts w:ascii="Arial" w:hAnsi="Arial" w:cs="Arial"/>
         </w:rPr>
-        <w:t>max</w:t>
-      </w:r>
-      <w:proofErr w:type="gramEnd"/>
-      <w:r>
-        <w:rPr>
-          <w:rStyle w:val="HTMLCode"/>
-          <w:rFonts w:ascii="Arial" w:hAnsi="Arial" w:cs="Arial"/>
-        </w:rPr>
-        <w:t>_temp</w:t>
+        <w:t>max_temp</w:t>
       </w:r>
       <w:proofErr w:type="spellEnd"/>
       <w:r>
@@ -324,7 +315,6 @@
         </w:rPr>
         <w:t xml:space="preserve"> </w:t>
       </w:r>
-      <w:proofErr w:type="gramStart"/>
       <w:r>
         <w:rPr>
           <w:rStyle w:val="HTMLCode"/>
@@ -338,15 +328,7 @@
           <w:rStyle w:val="HTMLCode"/>
           <w:rFonts w:ascii="Arial" w:hAnsi="Arial" w:cs="Arial"/>
         </w:rPr>
-        <w:t>mean</w:t>
-      </w:r>
-      <w:proofErr w:type="gramEnd"/>
-      <w:r>
-        <w:rPr>
-          <w:rStyle w:val="HTMLCode"/>
-          <w:rFonts w:ascii="Arial" w:hAnsi="Arial" w:cs="Arial"/>
-        </w:rPr>
-        <w:t>_temp</w:t>
+        <w:t>mean_temp</w:t>
       </w:r>
       <w:proofErr w:type="spellEnd"/>
       <w:r>
@@ -383,7 +365,6 @@
         </w:rPr>
         <w:t xml:space="preserve"> </w:t>
       </w:r>
-      <w:proofErr w:type="gramStart"/>
       <w:r>
         <w:rPr>
           <w:rStyle w:val="HTMLCode"/>
@@ -397,15 +378,7 @@
           <w:rStyle w:val="HTMLCode"/>
           <w:rFonts w:ascii="Arial" w:hAnsi="Arial" w:cs="Arial"/>
         </w:rPr>
-        <w:t>min</w:t>
-      </w:r>
-      <w:proofErr w:type="gramEnd"/>
-      <w:r>
-        <w:rPr>
-          <w:rStyle w:val="HTMLCode"/>
-          <w:rFonts w:ascii="Arial" w:hAnsi="Arial" w:cs="Arial"/>
-        </w:rPr>
-        <w:t>_temp</w:t>
+        <w:t>min_temp</w:t>
       </w:r>
       <w:proofErr w:type="spellEnd"/>
       <w:r>
@@ -447,23 +420,7 @@
           <w:rStyle w:val="HTMLCode"/>
           <w:rFonts w:ascii="Arial" w:hAnsi="Arial" w:cs="Arial"/>
         </w:rPr>
-        <w:t xml:space="preserve">&gt; </w:t>
-      </w:r>
-      <w:proofErr w:type="gramStart"/>
-      <w:r>
-        <w:rPr>
-          <w:rStyle w:val="HTMLCode"/>
-          <w:rFonts w:ascii="Arial" w:hAnsi="Arial" w:cs="Arial"/>
-        </w:rPr>
-        <w:t>{{ threshold</w:t>
-      </w:r>
-      <w:proofErr w:type="gramEnd"/>
-      <w:r>
-        <w:rPr>
-          <w:rStyle w:val="HTMLCode"/>
-          <w:rFonts w:ascii="Arial" w:hAnsi="Arial" w:cs="Arial"/>
-        </w:rPr>
-        <w:t xml:space="preserve"> }} °C</w:t>
+        <w:t>&gt; {{ threshold }} °C</w:t>
       </w:r>
     </w:p>
     <w:p>
@@ -534,7 +491,6 @@
       <w:pPr>
         <w:pStyle w:val="NormalWeb"/>
       </w:pPr>
-      <w:proofErr w:type="gramStart"/>
       <w:r>
         <w:rPr>
           <w:rStyle w:val="HTMLCode"/>
@@ -548,15 +504,7 @@
           <w:rStyle w:val="HTMLCode"/>
           <w:rFonts w:eastAsiaTheme="majorEastAsia"/>
         </w:rPr>
-        <w:t>true</w:t>
-      </w:r>
-      <w:proofErr w:type="gramEnd"/>
-      <w:r>
-        <w:rPr>
-          <w:rStyle w:val="HTMLCode"/>
-          <w:rFonts w:eastAsiaTheme="majorEastAsia"/>
-        </w:rPr>
-        <w:t>_color_image</w:t>
+        <w:t>true_color_image</w:t>
       </w:r>
       <w:proofErr w:type="spellEnd"/>
       <w:r>
@@ -586,7 +534,6 @@
       <w:pPr>
         <w:pStyle w:val="NormalWeb"/>
       </w:pPr>
-      <w:proofErr w:type="gramStart"/>
       <w:r>
         <w:rPr>
           <w:rStyle w:val="HTMLCode"/>
@@ -600,15 +547,7 @@
           <w:rStyle w:val="HTMLCode"/>
           <w:rFonts w:eastAsiaTheme="majorEastAsia"/>
         </w:rPr>
-        <w:t>full</w:t>
-      </w:r>
-      <w:proofErr w:type="gramEnd"/>
-      <w:r>
-        <w:rPr>
-          <w:rStyle w:val="HTMLCode"/>
-          <w:rFonts w:eastAsiaTheme="majorEastAsia"/>
-        </w:rPr>
-        <w:t>_thermal_image</w:t>
+        <w:t>full_thermal_image</w:t>
       </w:r>
       <w:proofErr w:type="spellEnd"/>
       <w:r>
@@ -638,7 +577,6 @@
       <w:pPr>
         <w:pStyle w:val="NormalWeb"/>
       </w:pPr>
-      <w:proofErr w:type="gramStart"/>
       <w:r>
         <w:rPr>
           <w:rStyle w:val="HTMLCode"/>
@@ -652,31 +590,17 @@
           <w:rStyle w:val="HTMLCode"/>
           <w:rFonts w:eastAsiaTheme="majorEastAsia"/>
         </w:rPr>
-        <w:t>heatmap</w:t>
-      </w:r>
-      <w:proofErr w:type="gramEnd"/>
+        <w:t>heatmap_image</w:t>
+      </w:r>
+      <w:proofErr w:type="spellEnd"/>
       <w:r>
         <w:rPr>
           <w:rStyle w:val="HTMLCode"/>
           <w:rFonts w:eastAsiaTheme="majorEastAsia"/>
         </w:rPr>
-        <w:t>_image</w:t>
-      </w:r>
-      <w:proofErr w:type="spellEnd"/>
-      <w:r>
-        <w:rPr>
-          <w:rStyle w:val="HTMLCode"/>
-          <w:rFonts w:eastAsiaTheme="majorEastAsia"/>
-        </w:rPr>
         <w:t xml:space="preserve"> }}</w:t>
       </w:r>
     </w:p>
-    <w:p>
-      <w:pPr>
-        <w:pStyle w:val="NormalWeb"/>
-      </w:pPr>
-    </w:p>
-    <w:p/>
     <w:sectPr>
       <w:pgSz w:w="12240" w:h="15840"/>
       <w:pgMar w:top="1440" w:right="1440" w:bottom="1440" w:left="1440" w:header="720" w:footer="720" w:gutter="0"/>

</xml_diff>